<commit_message>
Sprint 2: acceso a la cuenta, asistente de perfil, 4+1 en UML y reorganizacion segun el docente
- FS-HU-15, FS-HU-17, FS-HU-18 y FS-HU-19 implementadas; FS-HU-16 (Google) en espera

- Codigo trasladado a FASE 2/Evidencias Proyecto/Evidencias de sistema; capturas en Evidencias de documentacion/Sprint N

- Documentacion: DAS v1.10, DoD v1.5, Guia 2.4, backlog, casos de prueba 19/19, defectos y Sprint Backlog 2 (borrador)
</commit_message>
<xml_diff>
--- a/FASE 1/Evidencias Grupales/Material complementario/Documento_de_Épicas_e_Historias_de_Usuario.docx
+++ b/FASE 1/Evidencias Grupales/Material complementario/Documento_de_Épicas_e_Historias_de_Usuario.docx
@@ -1324,6 +1324,9 @@
                 <w:szCs w:val="24"/>
               </w:rPr>
             </w:pPr>
+            <w:r>
+              <w:t>1.2</w:t>
+            </w:r>
           </w:p>
         </w:tc>
         <w:tc>
@@ -1342,6 +1345,9 @@
                 <w:szCs w:val="24"/>
               </w:rPr>
             </w:pPr>
+            <w:r>
+              <w:t>21-09-2026</w:t>
+            </w:r>
           </w:p>
         </w:tc>
         <w:tc>
@@ -1360,6 +1366,9 @@
                 <w:szCs w:val="24"/>
               </w:rPr>
             </w:pPr>
+            <w:r>
+              <w:t>Se agregan a la épica E1 Gestión de usuarios FS-HU-15 (recuperar contraseña), FS-HU-16 (acceso con Google) y FS-HU-17 (registro con rol y sesión recordada)</w:t>
+            </w:r>
           </w:p>
         </w:tc>
         <w:tc>
@@ -1378,6 +1387,95 @@
                 <w:szCs w:val="24"/>
               </w:rPr>
             </w:pPr>
+            <w:r>
+              <w:t>Rodrigo Cárcamo Rojas</w:t>
+            </w:r>
+          </w:p>
+        </w:tc>
+      </w:tr>
+      <w:tr>
+        <w:tc>
+          <w:tcPr>
+            <w:tcW w:w="1826" w:type="dxa"/>
+          </w:tcPr>
+          <w:p>
+            <w:pPr>
+              <w:tabs>
+                <w:tab w:val="left" w:pos="1276"/>
+              </w:tabs>
+              <w:rPr>
+                <w:rFonts w:eastAsia="Times New Roman" w:cstheme="minorHAnsi"/>
+                <w:color w:val="000000" w:themeColor="text1"/>
+                <w:sz w:val="24"/>
+                <w:szCs w:val="24"/>
+              </w:rPr>
+            </w:pPr>
+            <w:r>
+              <w:t>1.3</w:t>
+            </w:r>
+          </w:p>
+        </w:tc>
+        <w:tc>
+          <w:tcPr>
+            <w:tcW w:w="1826" w:type="dxa"/>
+          </w:tcPr>
+          <w:p>
+            <w:pPr>
+              <w:tabs>
+                <w:tab w:val="left" w:pos="1276"/>
+              </w:tabs>
+              <w:rPr>
+                <w:rFonts w:eastAsia="Times New Roman" w:cstheme="minorHAnsi"/>
+                <w:color w:val="000000" w:themeColor="text1"/>
+                <w:sz w:val="24"/>
+                <w:szCs w:val="24"/>
+              </w:rPr>
+            </w:pPr>
+            <w:r>
+              <w:t>21-09-2026</w:t>
+            </w:r>
+          </w:p>
+        </w:tc>
+        <w:tc>
+          <w:tcPr>
+            <w:tcW w:w="3081" w:type="dxa"/>
+          </w:tcPr>
+          <w:p>
+            <w:pPr>
+              <w:tabs>
+                <w:tab w:val="left" w:pos="1276"/>
+              </w:tabs>
+              <w:rPr>
+                <w:rFonts w:eastAsia="Times New Roman" w:cstheme="minorHAnsi"/>
+                <w:color w:val="000000" w:themeColor="text1"/>
+                <w:sz w:val="24"/>
+                <w:szCs w:val="24"/>
+              </w:rPr>
+            </w:pPr>
+            <w:r>
+              <w:t>Se agregan a la épica E1 FS-HU-18 (objetivos y estilo de vida) y FS-HU-19 (información de salud), con el asistente de perfil de 4 pasos</w:t>
+            </w:r>
+          </w:p>
+        </w:tc>
+        <w:tc>
+          <w:tcPr>
+            <w:tcW w:w="2245" w:type="dxa"/>
+          </w:tcPr>
+          <w:p>
+            <w:pPr>
+              <w:tabs>
+                <w:tab w:val="left" w:pos="1276"/>
+              </w:tabs>
+              <w:rPr>
+                <w:rFonts w:eastAsia="Times New Roman" w:cstheme="minorHAnsi"/>
+                <w:color w:val="000000" w:themeColor="text1"/>
+                <w:sz w:val="24"/>
+                <w:szCs w:val="24"/>
+              </w:rPr>
+            </w:pPr>
+            <w:r>
+              <w:t>Rodrigo Cárcamo Rojas</w:t>
+            </w:r>
           </w:p>
         </w:tc>
       </w:tr>
@@ -2775,6 +2873,30 @@
                 <w:sz w:val="21"/>
               </w:rPr>
               <w:t>En la Fase 2 se incorporó la épica Reservas (E7) con prioridad Alta, porque completa el flujo principal de la plataforma: buscar, comparar y agendar con el profesional más conveniente.</w:t>
+            </w:r>
+          </w:p>
+          <w:p>
+            <w:r>
+              <w:rPr>
+                <w:rFonts w:ascii="Calibri" w:hAnsi="Calibri"/>
+                <w:b w:val="0"/>
+                <w:i w:val="0"/>
+                <w:color w:val="000000"/>
+                <w:sz w:val="21"/>
+              </w:rPr>
+              <w:t>En la Fase 2 (Sprint 2) la épica Gestión de usuarios (E1) incorporó la recuperación de contraseña por correo, el acceso con Google y la elección de rol en el registro (FS-HU-15 a FS-HU-17), manteniendo su prioridad Alta porque son requisito para que usuarios y profesionales accedan a la plataforma.</w:t>
+            </w:r>
+          </w:p>
+          <w:p>
+            <w:r>
+              <w:rPr>
+                <w:rFonts w:ascii="Calibri" w:hAnsi="Calibri"/>
+                <w:b w:val="0"/>
+                <w:i w:val="0"/>
+                <w:color w:val="000000"/>
+                <w:sz w:val="21"/>
+              </w:rPr>
+              <w:t>También en el Sprint 2 se agregaron a E1 FS-HU-18 y FS-HU-19 (prioridad Media): completan el perfil del usuario con su objetivo, estilo de vida e información de salud para entregar orientaciones más seguras.</w:t>
             </w:r>
           </w:p>
         </w:tc>

</xml_diff>

<commit_message>
FS-HU-20 Portada publica: documentacion (DAS v1.11, DoD v1.6, CP-020 a CP-023) y correccion del aviso de cierre de sesion
</commit_message>
<xml_diff>
--- a/FASE 1/Evidencias Grupales/Material complementario/Documento_de_Épicas_e_Historias_de_Usuario.docx
+++ b/FASE 1/Evidencias Grupales/Material complementario/Documento_de_Épicas_e_Historias_de_Usuario.docx
@@ -1479,6 +1479,92 @@
           </w:p>
         </w:tc>
       </w:tr>
+      <w:tr>
+        <w:tc>
+          <w:tcPr>
+            <w:tcW w:w="1826" w:type="dxa"/>
+          </w:tcPr>
+          <w:p>
+            <w:pPr>
+              <w:tabs>
+                <w:tab w:val="left" w:pos="1276"/>
+              </w:tabs>
+              <w:rPr>
+                <w:rFonts w:eastAsia="Times New Roman" w:cstheme="minorHAnsi"/>
+                <w:color w:val="000000" w:themeColor="text1"/>
+                <w:sz w:val="24"/>
+                <w:szCs w:val="24"/>
+              </w:rPr>
+            </w:pPr>
+            <w:r>
+              <w:t>1.4</w:t>
+            </w:r>
+          </w:p>
+        </w:tc>
+        <w:tc>
+          <w:tcPr>
+            <w:tcW w:w="1826" w:type="dxa"/>
+          </w:tcPr>
+          <w:p>
+            <w:pPr>
+              <w:tabs>
+                <w:tab w:val="left" w:pos="1276"/>
+              </w:tabs>
+              <w:rPr>
+                <w:rFonts w:eastAsia="Times New Roman" w:cstheme="minorHAnsi"/>
+                <w:color w:val="000000" w:themeColor="text1"/>
+                <w:sz w:val="24"/>
+                <w:szCs w:val="24"/>
+              </w:rPr>
+            </w:pPr>
+            <w:r>
+              <w:t>23-09-2026</w:t>
+            </w:r>
+          </w:p>
+        </w:tc>
+        <w:tc>
+          <w:tcPr>
+            <w:tcW w:w="3081" w:type="dxa"/>
+          </w:tcPr>
+          <w:p>
+            <w:pPr>
+              <w:tabs>
+                <w:tab w:val="left" w:pos="1276"/>
+              </w:tabs>
+              <w:rPr>
+                <w:rFonts w:eastAsia="Times New Roman" w:cstheme="minorHAnsi"/>
+                <w:color w:val="000000" w:themeColor="text1"/>
+                <w:sz w:val="24"/>
+                <w:szCs w:val="24"/>
+              </w:rPr>
+            </w:pPr>
+            <w:r>
+              <w:t>Se agrega a la épica E1 FS-HU-20 (portada pública), solo para quien no ha iniciado sesión</w:t>
+            </w:r>
+          </w:p>
+        </w:tc>
+        <w:tc>
+          <w:tcPr>
+            <w:tcW w:w="2245" w:type="dxa"/>
+          </w:tcPr>
+          <w:p>
+            <w:pPr>
+              <w:tabs>
+                <w:tab w:val="left" w:pos="1276"/>
+              </w:tabs>
+              <w:rPr>
+                <w:rFonts w:eastAsia="Times New Roman" w:cstheme="minorHAnsi"/>
+                <w:color w:val="000000" w:themeColor="text1"/>
+                <w:sz w:val="24"/>
+                <w:szCs w:val="24"/>
+              </w:rPr>
+            </w:pPr>
+            <w:r>
+              <w:t>Rodrigo Cárcamo Rojas</w:t>
+            </w:r>
+          </w:p>
+        </w:tc>
+      </w:tr>
     </w:tbl>
     <w:p>
       <w:pPr>
@@ -2897,6 +2983,18 @@
                 <w:sz w:val="21"/>
               </w:rPr>
               <w:t>También en el Sprint 2 se agregaron a E1 FS-HU-18 y FS-HU-19 (prioridad Media): completan el perfil del usuario con su objetivo, estilo de vida e información de salud para entregar orientaciones más seguras.</w:t>
+            </w:r>
+          </w:p>
+          <w:p>
+            <w:r>
+              <w:rPr>
+                <w:rFonts w:ascii="Calibri" w:hAnsi="Calibri"/>
+                <w:b w:val="0"/>
+                <w:i w:val="0"/>
+                <w:color w:val="000000"/>
+                <w:sz w:val="21"/>
+              </w:rPr>
+              <w:t>También en el Sprint 2 se agregó a E1 FS-HU-20 (prioridad Media): la portada pública presenta FitSearch a quien aún no tiene sesión y lo lleva al registro o al inicio de sesión.</w:t>
             </w:r>
           </w:p>
         </w:tc>

</xml_diff>

<commit_message>
FS-HU-16 y FS-HU-02: inicio de sesion con Google y el tipo de cuenta se elige en el asistente de perfil
</commit_message>
<xml_diff>
--- a/FASE 1/Evidencias Grupales/Material complementario/Documento_de_Épicas_e_Historias_de_Usuario.docx
+++ b/FASE 1/Evidencias Grupales/Material complementario/Documento_de_Épicas_e_Historias_de_Usuario.docx
@@ -1540,6 +1540,92 @@
             </w:pPr>
             <w:r>
               <w:t>Se agrega a la épica E1 FS-HU-20 (portada pública), solo para quien no ha iniciado sesión</w:t>
+            </w:r>
+          </w:p>
+        </w:tc>
+        <w:tc>
+          <w:tcPr>
+            <w:tcW w:w="2245" w:type="dxa"/>
+          </w:tcPr>
+          <w:p>
+            <w:pPr>
+              <w:tabs>
+                <w:tab w:val="left" w:pos="1276"/>
+              </w:tabs>
+              <w:rPr>
+                <w:rFonts w:eastAsia="Times New Roman" w:cstheme="minorHAnsi"/>
+                <w:color w:val="000000" w:themeColor="text1"/>
+                <w:sz w:val="24"/>
+                <w:szCs w:val="24"/>
+              </w:rPr>
+            </w:pPr>
+            <w:r>
+              <w:t>Rodrigo Cárcamo Rojas</w:t>
+            </w:r>
+          </w:p>
+        </w:tc>
+      </w:tr>
+      <w:tr>
+        <w:tc>
+          <w:tcPr>
+            <w:tcW w:w="1826" w:type="dxa"/>
+          </w:tcPr>
+          <w:p>
+            <w:pPr>
+              <w:tabs>
+                <w:tab w:val="left" w:pos="1276"/>
+              </w:tabs>
+              <w:rPr>
+                <w:rFonts w:eastAsia="Times New Roman" w:cstheme="minorHAnsi"/>
+                <w:color w:val="000000" w:themeColor="text1"/>
+                <w:sz w:val="24"/>
+                <w:szCs w:val="24"/>
+              </w:rPr>
+            </w:pPr>
+            <w:r>
+              <w:t>1.4</w:t>
+            </w:r>
+          </w:p>
+        </w:tc>
+        <w:tc>
+          <w:tcPr>
+            <w:tcW w:w="1826" w:type="dxa"/>
+          </w:tcPr>
+          <w:p>
+            <w:pPr>
+              <w:tabs>
+                <w:tab w:val="left" w:pos="1276"/>
+              </w:tabs>
+              <w:rPr>
+                <w:rFonts w:eastAsia="Times New Roman" w:cstheme="minorHAnsi"/>
+                <w:color w:val="000000" w:themeColor="text1"/>
+                <w:sz w:val="24"/>
+                <w:szCs w:val="24"/>
+              </w:rPr>
+            </w:pPr>
+            <w:r>
+              <w:t>24-09-2026</w:t>
+            </w:r>
+          </w:p>
+        </w:tc>
+        <w:tc>
+          <w:tcPr>
+            <w:tcW w:w="3081" w:type="dxa"/>
+          </w:tcPr>
+          <w:p>
+            <w:pPr>
+              <w:tabs>
+                <w:tab w:val="left" w:pos="1276"/>
+              </w:tabs>
+              <w:rPr>
+                <w:rFonts w:eastAsia="Times New Roman" w:cstheme="minorHAnsi"/>
+                <w:color w:val="000000" w:themeColor="text1"/>
+                <w:sz w:val="24"/>
+                <w:szCs w:val="24"/>
+              </w:rPr>
+            </w:pPr>
+            <w:r>
+              <w:t>El tipo de cuenta (rol) sale del registro y pasa al primer paso del asistente de perfil: se ajustan FS-HU-02 (escenario nuevo), FS-HU-16 y FS-HU-17</w:t>
             </w:r>
           </w:p>
         </w:tc>

</xml_diff>